<commit_message>
powiekszenie grupowania do 2 wyników
</commit_message>
<xml_diff>
--- a/Inżynierka.docx
+++ b/Inżynierka.docx
@@ -365,6 +365,19 @@
       </w:pPr>
       <w:r>
         <w:br/>
+      </w:r>
+    </w:p>
+    <w:p>
+      <w:pPr>
+        <w:spacing w:line="276" w:lineRule="auto"/>
+      </w:pPr>
+    </w:p>
+    <w:p>
+      <w:pPr>
+        <w:spacing w:line="276" w:lineRule="auto"/>
+      </w:pPr>
+      <w:r>
+        <w:lastRenderedPageBreak/>
         <w:t>Literatury:</w:t>
       </w:r>
       <w:r>
@@ -381,9 +394,6 @@
       </w:r>
       <w:r>
         <w:br/>
-      </w:r>
-      <w:r>
-        <w:lastRenderedPageBreak/>
         <w:t xml:space="preserve">Czesław </w:t>
       </w:r>
       <w:proofErr w:type="spellStart"/>
@@ -1371,6 +1381,7 @@
   <w:style w:type="character" w:default="1" w:styleId="Domylnaczcionkaakapitu">
     <w:name w:val="Default Paragraph Font"/>
     <w:uiPriority w:val="1"/>
+    <w:semiHidden/>
     <w:unhideWhenUsed/>
   </w:style>
   <w:style w:type="table" w:default="1" w:styleId="Standardowy">

</xml_diff>

<commit_message>
dodanie regresji wielomaianowej z zaglami (brak logiki zeglarskiej)
</commit_message>
<xml_diff>
--- a/Inżynierka.docx
+++ b/Inżynierka.docx
@@ -917,42 +917,22 @@
         <w:spacing w:line="276" w:lineRule="auto"/>
       </w:pPr>
       <w:r>
-        <w:t>Im bardziej płyniemy pod wiatr (</w:t>
-      </w:r>
-      <w:r>
-        <w:t>kursy ostre</w:t>
-      </w:r>
-      <w:r>
-        <w:t>), tym mniejsze żagle powinniśmy stosować, aby ograniczyć siłę przechylającą i utrzymać równowagę żaglową.</w:t>
-      </w:r>
-    </w:p>
-    <w:p>
-      <w:pPr>
-        <w:spacing w:line="276" w:lineRule="auto"/>
-      </w:pPr>
-      <w:r>
-        <w:t>Z kolei im bardziej płyniemy z wiatrem (</w:t>
-      </w:r>
-      <w:r>
-        <w:t>kursy pełne</w:t>
-      </w:r>
-      <w:r>
-        <w:t>), tym większe żagle możemy rozwinąć, ponieważ wówczas większe znaczenie ma klasyczna „siła pchająca” opisana trzecią zasadą dynamiki Newtona, a wpływ siły przechylającej staje się znikomy.</w:t>
-      </w:r>
-    </w:p>
-    <w:p>
-      <w:pPr>
-        <w:spacing w:line="276" w:lineRule="auto"/>
-        <w:rPr>
-          <w:b/>
-          <w:bCs/>
-        </w:rPr>
-      </w:pPr>
-      <w:r>
-        <w:rPr>
-          <w:b/>
-          <w:bCs/>
-        </w:rPr>
+        <w:t>Im bardziej płyniemy pod wiatr (kursy ostre), tym mniejsze żagle powinniśmy stosować, aby ograniczyć siłę przechylającą i utrzymać równowagę żaglową.</w:t>
+      </w:r>
+    </w:p>
+    <w:p>
+      <w:pPr>
+        <w:spacing w:line="276" w:lineRule="auto"/>
+      </w:pPr>
+      <w:r>
+        <w:t>Z kolei im bardziej płyniemy z wiatrem (kursy pełne), tym większe żagle możemy rozwinąć, ponieważ wówczas większe znaczenie ma klasyczna „siła pchająca” opisana trzecią zasadą dynamiki Newtona, a wpływ siły przechylającej staje się znikomy.</w:t>
+      </w:r>
+    </w:p>
+    <w:p>
+      <w:pPr>
+        <w:spacing w:line="276" w:lineRule="auto"/>
+      </w:pPr>
+      <w:r>
         <w:t>Współpraca żagli</w:t>
       </w:r>
     </w:p>
@@ -963,462 +943,367 @@
       <w:r>
         <w:t>Wiedząc już, że na kursach pełnych można stosować większe żagle, warto omówić współdziałanie pomiędzy poszczególnymi żaglami.</w:t>
       </w:r>
+    </w:p>
+    <w:p>
+      <w:pPr>
+        <w:spacing w:line="276" w:lineRule="auto"/>
+      </w:pPr>
+      <w:r>
+        <w:t>Dobór odpowiedniego zestawu ożaglowania wpływa nie tylko na prędkość jachtu, ale również na jego zrównoważenie i stateczność kursową.</w:t>
+      </w:r>
+    </w:p>
+    <w:p>
+      <w:pPr>
+        <w:spacing w:line="276" w:lineRule="auto"/>
+      </w:pPr>
+      <w:r>
+        <w:t>W klasycznym układzie ożaglowania jacht posiada żagiel główny (grot) oraz żagiel przedni (fok lub genua).</w:t>
+      </w:r>
+    </w:p>
+    <w:p>
+      <w:pPr>
+        <w:spacing w:line="276" w:lineRule="auto"/>
+      </w:pPr>
+      <w:r>
+        <w:t>Choć oba żagle działają niezależnie, to ich pola przepływu powietrza wzajemnie na siebie oddziałują.</w:t>
+      </w:r>
+    </w:p>
+    <w:p>
+      <w:pPr>
+        <w:spacing w:line="276" w:lineRule="auto"/>
+      </w:pPr>
+      <w:r>
+        <w:t xml:space="preserve">Nie jest jednak prawdą, jak dawniej sądzono, że przestrzeń pomiędzy fokiem a grotem działa jak dysza </w:t>
+      </w:r>
+      <w:proofErr w:type="spellStart"/>
+      <w:r>
+        <w:t>Venturiego</w:t>
+      </w:r>
+      <w:proofErr w:type="spellEnd"/>
+      <w:r>
+        <w:t xml:space="preserve"> przyspieszająca przepływ powietrza.</w:t>
+      </w:r>
+    </w:p>
+    <w:p>
+      <w:pPr>
+        <w:spacing w:line="276" w:lineRule="auto"/>
+      </w:pPr>
+      <w:r>
+        <w:t xml:space="preserve">Badania Czesława </w:t>
+      </w:r>
+      <w:proofErr w:type="spellStart"/>
+      <w:r>
+        <w:t>Marchaja</w:t>
+      </w:r>
+      <w:proofErr w:type="spellEnd"/>
+      <w:r>
+        <w:t xml:space="preserve"> jednoznacznie wykazały, że zjawisko to nie występuje, a ewentualne przyspieszenia przepływu są lokalne i nie mają istotnego wpływu na całkowitą siłę aerodynamiczną żagli.</w:t>
+      </w:r>
+    </w:p>
+    <w:p>
+      <w:pPr>
+        <w:spacing w:line="276" w:lineRule="auto"/>
+      </w:pPr>
+      <w:r>
+        <w:lastRenderedPageBreak/>
+        <w:t>W rzeczywistości fok wpływa głównie na kąt natarcia wiatru na grot, modyfikując jego charakterystykę pracy.</w:t>
+      </w:r>
+    </w:p>
+    <w:p>
+      <w:pPr>
+        <w:spacing w:line="276" w:lineRule="auto"/>
+      </w:pPr>
+      <w:r>
+        <w:t>W odpowiednim ustawieniu fok może poprawić ogólną efektywność ożaglowania, ponieważ powoduje korzystniejsze rozłożenie strug powietrza za jego krawędzią spływu, co pozwala grotu pracować przy nieco większych kątach natarcia bez utraty opływu laminarnego.</w:t>
+      </w:r>
+    </w:p>
+    <w:p>
+      <w:pPr>
+        <w:spacing w:line="276" w:lineRule="auto"/>
+      </w:pPr>
+      <w:r>
+        <w:t>Zbyt duży lub zbyt blisko ustawiony fok może jednak powodować zakłócenia przepływu i pogorszyć charakterystykę aerodynamiczną grota.</w:t>
+      </w:r>
+    </w:p>
+    <w:p>
+      <w:pPr>
+        <w:spacing w:line="276" w:lineRule="auto"/>
+      </w:pPr>
+      <w:r>
+        <w:t>Dobór powierzchni żagli</w:t>
+      </w:r>
+    </w:p>
+    <w:p>
+      <w:pPr>
+        <w:spacing w:line="276" w:lineRule="auto"/>
+      </w:pPr>
+      <w:r>
+        <w:t xml:space="preserve">Na kursach ostrych, gdzie najważniejsze jest wykorzystanie siły aerodynamicznej działającej zgodnie z prawem </w:t>
+      </w:r>
+      <w:proofErr w:type="spellStart"/>
+      <w:r>
+        <w:t>Bernoulliego</w:t>
+      </w:r>
+      <w:proofErr w:type="spellEnd"/>
+      <w:r>
+        <w:t>, stosuje się mniejsze żagle przednie i często refuje grota, aby ograniczyć przechył i zmniejszyć opory hydrodynamiczne.</w:t>
+      </w:r>
+    </w:p>
+    <w:p>
+      <w:pPr>
+        <w:spacing w:line="276" w:lineRule="auto"/>
+      </w:pPr>
+      <w:r>
+        <w:t>Na kursach pełnych, gdzie przechył ma mniejsze znaczenie, a żagle pracują bardziej „na ciąg”, można zwiększyć powierzchnię ożaglowania – np. poprzez użycie większego foka (genuy) lub żagli dodatkowych.</w:t>
+      </w:r>
+    </w:p>
+    <w:p>
+      <w:pPr>
+        <w:spacing w:line="276" w:lineRule="auto"/>
+      </w:pPr>
+      <w:r>
+        <w:t xml:space="preserve">Żagle dodatkowe: spinaker i </w:t>
+      </w:r>
+      <w:proofErr w:type="spellStart"/>
+      <w:r>
+        <w:t>genaker</w:t>
+      </w:r>
+      <w:proofErr w:type="spellEnd"/>
+    </w:p>
+    <w:p>
+      <w:pPr>
+        <w:spacing w:line="276" w:lineRule="auto"/>
+      </w:pPr>
+      <w:r>
+        <w:t xml:space="preserve">Na kursach z wiatrem (pełny baksztag, fordewind) powszechnie stosuje się spinaker lub </w:t>
+      </w:r>
+      <w:proofErr w:type="spellStart"/>
+      <w:r>
+        <w:t>genaker</w:t>
+      </w:r>
+      <w:proofErr w:type="spellEnd"/>
+      <w:r>
+        <w:t xml:space="preserve"> – duże, lekkie żagle o wypukłym kształcie, które wykorzystują głównie siłę reakcji wiatru, a nie efekt aerodynamiczny.</w:t>
+      </w:r>
+    </w:p>
+    <w:p>
+      <w:pPr>
+        <w:spacing w:line="276" w:lineRule="auto"/>
+      </w:pPr>
+      <w:r>
+        <w:t>W przeciwieństwie do grota i foka, spinaker nie generuje siły nośnej, lecz działa jak „żagiel pchający” – zgodnie z trzecią zasadą dynamiki Newtona.</w:t>
+      </w:r>
+    </w:p>
+    <w:p>
+      <w:pPr>
+        <w:spacing w:line="276" w:lineRule="auto"/>
+      </w:pPr>
+      <w:r>
+        <w:t>Dzięki dużej powierzchni i korzystnemu kątowi względem wiatru znacząco zwiększa prędkość jachtu na kursach pełnych, jednak jego użycie wymaga odpowiedniego doświadczenia i umiarkowanej siły wiatru, aby nie doprowadzić do utraty kontroli nad jednostką</w:t>
+      </w:r>
+    </w:p>
+    <w:p>
+      <w:pPr>
+        <w:spacing w:line="276" w:lineRule="auto"/>
+      </w:pPr>
+      <w:r>
+        <w:t>Wpływ zafalowania na prędkość jachtu</w:t>
+      </w:r>
+    </w:p>
+    <w:p>
+      <w:pPr>
+        <w:spacing w:line="276" w:lineRule="auto"/>
+      </w:pPr>
+    </w:p>
+    <w:p>
+      <w:pPr>
+        <w:spacing w:line="276" w:lineRule="auto"/>
+      </w:pPr>
+      <w:r>
+        <w:t>Na prędkość jachtu wpływa nie tylko siła i kierunek wiatru, ale również stan akwenu, a w szczególności zafalowanie.</w:t>
+      </w:r>
+    </w:p>
+    <w:p>
+      <w:pPr>
+        <w:spacing w:line="276" w:lineRule="auto"/>
+      </w:pPr>
+      <w:r>
+        <w:t>Ruch wody w postaci fal może w znacznym stopniu zmieniać charakter oporu hydrodynamicznego oraz skuteczność pracy żagli.</w:t>
+      </w:r>
+    </w:p>
+    <w:p>
+      <w:pPr>
+        <w:spacing w:line="276" w:lineRule="auto"/>
+      </w:pPr>
+    </w:p>
+    <w:p>
+      <w:pPr>
+        <w:spacing w:line="276" w:lineRule="auto"/>
+      </w:pPr>
+      <w:r>
+        <w:t>W warunkach silnego zafalowania jacht poruszający się pod fale doświadcza cyklicznego hamowania przy każdym uderzeniu dziobu o grzbiet fali. Zwiększa się wtedy opór hydrodynamiczny, kadłub okresowo wynurza się z wody, a żagle tracą część efektywnego przepływu powietrza. Wszystko to skutkuje spadkiem prędkości i większym zużyciem energii (lub większym obciążeniem załogi przy żegludze sportowej).</w:t>
+      </w:r>
+    </w:p>
+    <w:p>
+      <w:pPr>
+        <w:spacing w:line="276" w:lineRule="auto"/>
+      </w:pPr>
+    </w:p>
+    <w:p>
+      <w:pPr>
+        <w:spacing w:line="276" w:lineRule="auto"/>
+      </w:pPr>
+      <w:r>
+        <w:lastRenderedPageBreak/>
+        <w:t>Z kolei podczas żeglugi z falą sytuacja jest odmienna. Fale mogą wspomagać ruch jednostki, częściowo „pchając” jacht od rufy. Doświadczony sternik potrafi w takich warunkach wykorzystać moment zjazdu z fali, aby zwiększyć prędkość – zjawisko to przypomina tzw. surfowanie na fali. Wymaga to jednak bardzo precyzyjnego prowadzenia jachtu, ponieważ niewłaściwe ustawienie kursu może doprowadzić do utraty kontroli lub niebezpiecznego przechyłu bocznego.</w:t>
+      </w:r>
+    </w:p>
+    <w:p>
+      <w:pPr>
+        <w:spacing w:line="276" w:lineRule="auto"/>
+      </w:pPr>
+    </w:p>
+    <w:p>
+      <w:pPr>
+        <w:spacing w:line="276" w:lineRule="auto"/>
+      </w:pPr>
+      <w:r>
+        <w:t>Zafalowanie jest więc czynnikiem silnie zależnym od umiejętności sternika.</w:t>
+      </w:r>
+    </w:p>
+    <w:p>
+      <w:pPr>
+        <w:spacing w:line="276" w:lineRule="auto"/>
+      </w:pPr>
+      <w:r>
+        <w:t>Z tego powodu w niniejszym algorytmie nie jest ono bezpośrednio uwzględnione jako zmienna wejściowa.</w:t>
+      </w:r>
+    </w:p>
+    <w:p>
+      <w:pPr>
+        <w:spacing w:line="276" w:lineRule="auto"/>
+      </w:pPr>
+      <w:r>
+        <w:t>Choć teoretycznie można by je opisać parametrem wysokości i okresu fali, w praktyce wpływ falowania na prędkość jachtu zależy przede wszystkim od sposobu prowadzenia jednostki.</w:t>
+      </w:r>
+    </w:p>
+    <w:p>
+      <w:pPr>
+        <w:spacing w:line="276" w:lineRule="auto"/>
+      </w:pPr>
+    </w:p>
+    <w:p>
+      <w:pPr>
+        <w:spacing w:line="276" w:lineRule="auto"/>
+      </w:pPr>
+      <w:r>
+        <w:t>Warto również wspomnieć o zjawisku tzw. martwej fali.</w:t>
+      </w:r>
+    </w:p>
+    <w:p>
+      <w:pPr>
+        <w:spacing w:line="276" w:lineRule="auto"/>
+      </w:pPr>
+      <w:r>
+        <w:t>Występuje ono po ustaniu silnego wiatru – zanim morze zdąży się „uspokoić”, fale wciąż utrzymują się na poziomie odpowiadającym wcześniejszym, silniejszym podmuchom.</w:t>
+      </w:r>
+    </w:p>
+    <w:p>
+      <w:pPr>
+        <w:spacing w:line="276" w:lineRule="auto"/>
+      </w:pPr>
+      <w:r>
+        <w:t>W efekcie jacht może poruszać się w warunkach słabego wiatru, ale przy dużych falach, co powoduje znaczne straty prędkości mimo teoretycznie sprzyjających warunków aerodynamicznych.</w:t>
+      </w:r>
       <w:r>
         <w:br/>
-        <w:t>Dobór odpowiedniego zestawu ożaglowania wpływa nie tylko na prędkość jachtu, ale również na jego zrównoważenie i stateczność kursową.</w:t>
-      </w:r>
-    </w:p>
-    <w:p>
-      <w:pPr>
-        <w:spacing w:line="276" w:lineRule="auto"/>
-      </w:pPr>
-      <w:r>
-        <w:t xml:space="preserve">W klasycznym układzie ożaglowania jacht posiada </w:t>
-      </w:r>
-      <w:r>
-        <w:rPr>
-          <w:b/>
-          <w:bCs/>
-        </w:rPr>
-        <w:t>żagiel główny (grot)</w:t>
-      </w:r>
-      <w:r>
-        <w:t xml:space="preserve"> oraz </w:t>
-      </w:r>
-      <w:r>
-        <w:rPr>
-          <w:b/>
-          <w:bCs/>
-        </w:rPr>
-        <w:t>żagiel przedni (fok lub genua)</w:t>
-      </w:r>
-      <w:r>
-        <w:t>.</w:t>
-      </w:r>
-      <w:r>
-        <w:br/>
-        <w:t>Choć oba żagle działają niezależnie, to ich pola przepływu powietrza wzajemnie na siebie oddziałują.</w:t>
-      </w:r>
-      <w:r>
-        <w:br/>
-        <w:t xml:space="preserve">Nie jest jednak prawdą, jak dawniej sądzono, że przestrzeń pomiędzy fokiem a grotem działa jak </w:t>
-      </w:r>
-      <w:r>
-        <w:rPr>
-          <w:i/>
-          <w:iCs/>
-        </w:rPr>
-        <w:t xml:space="preserve">dysza </w:t>
+      </w:r>
+    </w:p>
+    <w:p>
+      <w:pPr>
+        <w:spacing w:line="276" w:lineRule="auto"/>
+      </w:pPr>
+      <w:r>
+        <w:t>Trym żagli</w:t>
+      </w:r>
+    </w:p>
+    <w:p>
+      <w:pPr>
+        <w:spacing w:line="276" w:lineRule="auto"/>
+      </w:pPr>
+    </w:p>
+    <w:p>
+      <w:pPr>
+        <w:spacing w:line="276" w:lineRule="auto"/>
+      </w:pPr>
+      <w:r>
+        <w:t>Na prędkość jachtu wpływa nie tylko rodzaj i powierzchnia użytych żagli, ale również sposób ich ustawienia, czyli tzw. trym żagli.</w:t>
+      </w:r>
+    </w:p>
+    <w:p>
+      <w:pPr>
+        <w:spacing w:line="276" w:lineRule="auto"/>
+      </w:pPr>
+      <w:r>
+        <w:t>Trym to dostosowanie kształtu i położenia żagla do aktualnych warunków wiatrowych oraz kursu jachtu, w celu uzyskania maksymalnej siły ciągu przy minimalnych stratach energii.</w:t>
+      </w:r>
+    </w:p>
+    <w:p>
+      <w:pPr>
+        <w:spacing w:line="276" w:lineRule="auto"/>
+      </w:pPr>
+    </w:p>
+    <w:p>
+      <w:pPr>
+        <w:spacing w:line="276" w:lineRule="auto"/>
+      </w:pPr>
+      <w:r>
+        <w:t>Na kształt żagla można wpływać na wiele sposobów.</w:t>
+      </w:r>
+    </w:p>
+    <w:p>
+      <w:pPr>
+        <w:spacing w:line="276" w:lineRule="auto"/>
+      </w:pPr>
+      <w:r>
+        <w:t xml:space="preserve">Najważniejszym z nich jest zmiana położenia żagla względem osi jachtu, czyli jego wybieranie lub luzowanie. Jednak to nie jedyny element trymu. Żagiel można również bardziej </w:t>
       </w:r>
       <w:proofErr w:type="spellStart"/>
       <w:r>
-        <w:rPr>
-          <w:i/>
-          <w:iCs/>
-        </w:rPr>
-        <w:t>Venturiego</w:t>
+        <w:t>wypłaszczyć</w:t>
       </w:r>
       <w:proofErr w:type="spellEnd"/>
       <w:r>
-        <w:t xml:space="preserve"> przyspieszająca przepływ powietrza.</w:t>
-      </w:r>
-      <w:r>
-        <w:br/>
-        <w:t xml:space="preserve">Badania Czesława </w:t>
-      </w:r>
-      <w:proofErr w:type="spellStart"/>
-      <w:r>
-        <w:t>Marchaja</w:t>
-      </w:r>
-      <w:proofErr w:type="spellEnd"/>
-      <w:r>
-        <w:t xml:space="preserve"> jednoznacznie wykazały, że zjawisko to nie występuje, a ewentualne przyspieszenia przepływu są lokalne i nie mają istotnego wpływu na całkowitą siłę aerodynamiczną żagli.</w:t>
-      </w:r>
-    </w:p>
-    <w:p>
-      <w:pPr>
-        <w:spacing w:line="276" w:lineRule="auto"/>
-      </w:pPr>
-      <w:r>
-        <w:t xml:space="preserve">W rzeczywistości </w:t>
-      </w:r>
-      <w:r>
-        <w:rPr>
-          <w:b/>
-          <w:bCs/>
-        </w:rPr>
-        <w:t>fok wpływa głównie na kąt natarcia wiatru na grot</w:t>
-      </w:r>
-      <w:r>
-        <w:t>, modyfikując jego charakterystykę pracy.</w:t>
-      </w:r>
-      <w:r>
-        <w:br/>
-        <w:t xml:space="preserve">W odpowiednim ustawieniu fok może poprawić ogólną efektywność ożaglowania, ponieważ </w:t>
-      </w:r>
+        <w:t xml:space="preserve"> lub wybrzuszyć, co ma istotny wpływ na sposób przepływu powietrza po jego powierzchni.</w:t>
+      </w:r>
+    </w:p>
+    <w:p>
+      <w:pPr>
+        <w:spacing w:line="276" w:lineRule="auto"/>
+      </w:pPr>
+      <w:r>
+        <w:t>Dodatkowo można otworzyć lik wolny (tylną krawędź żagla), zmieniając kąt, pod jakim powietrze opuszcza żagiel, co pozwala dopasować jego pracę do aktualnej siły i kierunku wiatru.</w:t>
+      </w:r>
+    </w:p>
+    <w:p>
+      <w:pPr>
+        <w:spacing w:line="276" w:lineRule="auto"/>
+      </w:pPr>
+    </w:p>
+    <w:p>
+      <w:pPr>
+        <w:spacing w:line="276" w:lineRule="auto"/>
+      </w:pPr>
+      <w:r>
+        <w:t>Zmiana trymu jednego żagla wpływa również na pracę pozostałych.</w:t>
+      </w:r>
+    </w:p>
+    <w:p>
+      <w:pPr>
+        <w:spacing w:line="276" w:lineRule="auto"/>
+      </w:pPr>
       <w:r>
         <w:lastRenderedPageBreak/>
-        <w:t>powoduje korzystniejsze rozłożenie strug powietrza za jego krawędzią spływu, co pozwala grotu pracować przy nieco większych kątach natarcia bez utraty opływu laminarnego.</w:t>
-      </w:r>
-      <w:r>
-        <w:br/>
-        <w:t>Zbyt duży lub zbyt blisko ustawiony fok może jednak powodować zakłócenia przepływu i pogorszyć charakterystykę aerodynamiczną grota.</w:t>
-      </w:r>
-    </w:p>
-    <w:p>
-      <w:pPr>
-        <w:spacing w:line="276" w:lineRule="auto"/>
-        <w:rPr>
-          <w:b/>
-          <w:bCs/>
-        </w:rPr>
-      </w:pPr>
-      <w:r>
-        <w:rPr>
-          <w:b/>
-          <w:bCs/>
-        </w:rPr>
-        <w:t>Dobór powierzchni żagli</w:t>
-      </w:r>
-    </w:p>
-    <w:p>
-      <w:pPr>
-        <w:spacing w:line="276" w:lineRule="auto"/>
-      </w:pPr>
-      <w:r>
-        <w:t xml:space="preserve">Na kursach ostrych, gdzie najważniejsze jest wykorzystanie siły aerodynamicznej działającej zgodnie z prawem </w:t>
-      </w:r>
-      <w:proofErr w:type="spellStart"/>
-      <w:r>
-        <w:t>Bernoulliego</w:t>
-      </w:r>
-      <w:proofErr w:type="spellEnd"/>
-      <w:r>
-        <w:t xml:space="preserve">, stosuje się </w:t>
-      </w:r>
-      <w:r>
-        <w:rPr>
-          <w:b/>
-          <w:bCs/>
-        </w:rPr>
-        <w:t>mniejsze żagle przednie</w:t>
-      </w:r>
-      <w:r>
-        <w:t xml:space="preserve"> i często refuje grota, aby ograniczyć przechył i zmniejszyć opory hydrodynamiczne.</w:t>
-      </w:r>
-      <w:r>
-        <w:br/>
-        <w:t xml:space="preserve">Na kursach pełnych, gdzie przechył ma mniejsze znaczenie, a żagle pracują bardziej „na ciąg”, można zwiększyć powierzchnię ożaglowania – np. poprzez użycie </w:t>
-      </w:r>
-      <w:r>
-        <w:rPr>
-          <w:b/>
-          <w:bCs/>
-        </w:rPr>
-        <w:t>większego foka (genuy)</w:t>
-      </w:r>
-      <w:r>
-        <w:t xml:space="preserve"> lub </w:t>
-      </w:r>
-      <w:r>
-        <w:rPr>
-          <w:b/>
-          <w:bCs/>
-        </w:rPr>
-        <w:t>żagli dodatkowych</w:t>
-      </w:r>
-      <w:r>
-        <w:t>.</w:t>
-      </w:r>
-    </w:p>
-    <w:p>
-      <w:pPr>
-        <w:spacing w:line="276" w:lineRule="auto"/>
-        <w:rPr>
-          <w:b/>
-          <w:bCs/>
-        </w:rPr>
-      </w:pPr>
-      <w:r>
-        <w:rPr>
-          <w:b/>
-          <w:bCs/>
-        </w:rPr>
-        <w:t xml:space="preserve">Żagle dodatkowe: spinaker i </w:t>
-      </w:r>
-      <w:proofErr w:type="spellStart"/>
-      <w:r>
-        <w:rPr>
-          <w:b/>
-          <w:bCs/>
-        </w:rPr>
-        <w:t>genaker</w:t>
-      </w:r>
-      <w:proofErr w:type="spellEnd"/>
-    </w:p>
-    <w:p>
-      <w:pPr>
-        <w:spacing w:line="276" w:lineRule="auto"/>
-      </w:pPr>
-      <w:r>
-        <w:t xml:space="preserve">Na kursach z wiatrem (pełny baksztag, fordewind) powszechnie stosuje się </w:t>
-      </w:r>
-      <w:r>
-        <w:rPr>
-          <w:b/>
-          <w:bCs/>
-        </w:rPr>
-        <w:t>spinaker</w:t>
-      </w:r>
-      <w:r>
-        <w:t xml:space="preserve"> lub </w:t>
-      </w:r>
-      <w:proofErr w:type="spellStart"/>
-      <w:r>
-        <w:rPr>
-          <w:b/>
-          <w:bCs/>
-        </w:rPr>
-        <w:t>genaker</w:t>
-      </w:r>
-      <w:proofErr w:type="spellEnd"/>
-      <w:r>
-        <w:t xml:space="preserve"> – duże, lekkie żagle o wypukłym kształcie, które wykorzystują głównie </w:t>
-      </w:r>
-      <w:r>
-        <w:rPr>
-          <w:i/>
-          <w:iCs/>
-        </w:rPr>
-        <w:t>siłę reakcji wiatru</w:t>
-      </w:r>
-      <w:r>
-        <w:t>, a nie efekt aerodynamiczny.</w:t>
-      </w:r>
-      <w:r>
-        <w:br/>
-        <w:t>W przeciwieństwie do grota i foka, spinaker nie generuje siły nośnej, lecz działa jak „żagiel pchający” – zgodnie z trzecią zasadą dynamiki Newtona.</w:t>
-      </w:r>
-      <w:r>
-        <w:br/>
-        <w:t>Dzięki dużej powierzchni i korzystnemu kątowi względem wiatru znacząco zwiększa prędkość jachtu na kursach pełnych, jednak jego użycie wymaga odpowiedniego doświadczenia i umiarkowanej siły wiatru, aby nie doprowadzić do utraty kontroli nad jednostką</w:t>
-      </w:r>
-    </w:p>
-    <w:p>
-      <w:pPr>
-        <w:spacing w:line="276" w:lineRule="auto"/>
-      </w:pPr>
-    </w:p>
-    <w:p>
-      <w:pPr>
-        <w:spacing w:line="276" w:lineRule="auto"/>
-      </w:pPr>
-      <w:r>
-        <w:t>Wpływ zafalowania na prędkość jachtu</w:t>
-      </w:r>
-    </w:p>
-    <w:p>
-      <w:pPr>
-        <w:spacing w:line="276" w:lineRule="auto"/>
-      </w:pPr>
-    </w:p>
-    <w:p>
-      <w:pPr>
-        <w:spacing w:line="276" w:lineRule="auto"/>
-      </w:pPr>
-      <w:r>
-        <w:t>Na prędkość jachtu wpływa nie tylko siła i kierunek wiatru, ale również stan akwenu, a w szczególności zafalowanie.</w:t>
-      </w:r>
-    </w:p>
-    <w:p>
-      <w:pPr>
-        <w:spacing w:line="276" w:lineRule="auto"/>
-      </w:pPr>
-      <w:r>
-        <w:t>Ruch wody w postaci fal może w znacznym stopniu zmieniać charakter oporu hydrodynamicznego oraz skuteczność pracy żagli.</w:t>
-      </w:r>
-    </w:p>
-    <w:p>
-      <w:pPr>
-        <w:spacing w:line="276" w:lineRule="auto"/>
-      </w:pPr>
-    </w:p>
-    <w:p>
-      <w:pPr>
-        <w:spacing w:line="276" w:lineRule="auto"/>
-      </w:pPr>
-      <w:r>
-        <w:t>W warunkach silnego zafalowania jacht poruszający się pod fale doświadcza cyklicznego hamowania przy każdym uderzeniu dziobu o grzbiet fali. Zwiększa się wtedy opór hydrodynamiczny, kadłub okresowo wynurza się z wody, a żagle tracą część efektywnego przepływu powietrza. Wszystko to skutkuje spadkiem prędkości i większym zużyciem energii (lub większym obciążeniem załogi przy żegludze sportowej).</w:t>
-      </w:r>
-    </w:p>
-    <w:p>
-      <w:pPr>
-        <w:spacing w:line="276" w:lineRule="auto"/>
-      </w:pPr>
-    </w:p>
-    <w:p>
-      <w:pPr>
-        <w:spacing w:line="276" w:lineRule="auto"/>
-      </w:pPr>
-      <w:r>
-        <w:t xml:space="preserve">Z kolei podczas żeglugi z falą sytuacja jest odmienna. Fale mogą wspomagać ruch jednostki, częściowo „pchając” jacht od rufy. Doświadczony sternik potrafi w takich warunkach wykorzystać moment zjazdu z fali, aby zwiększyć prędkość – zjawisko to przypomina tzw. surfowanie na fali. Wymaga to jednak bardzo precyzyjnego prowadzenia jachtu, ponieważ </w:t>
-      </w:r>
-      <w:r>
-        <w:lastRenderedPageBreak/>
-        <w:t>niewłaściwe ustawienie kursu może doprowadzić do utraty kontroli</w:t>
-      </w:r>
-      <w:r>
-        <w:t xml:space="preserve"> </w:t>
-      </w:r>
-      <w:r>
-        <w:t>lub niebezpiecznego przechyłu bocznego.</w:t>
-      </w:r>
-    </w:p>
-    <w:p>
-      <w:pPr>
-        <w:spacing w:line="276" w:lineRule="auto"/>
-      </w:pPr>
-    </w:p>
-    <w:p>
-      <w:pPr>
-        <w:spacing w:line="276" w:lineRule="auto"/>
-      </w:pPr>
-      <w:r>
-        <w:t>Zafalowanie jest więc czynnikiem silnie zależnym od umiejętności sternika.</w:t>
-      </w:r>
-    </w:p>
-    <w:p>
-      <w:pPr>
-        <w:spacing w:line="276" w:lineRule="auto"/>
-      </w:pPr>
-      <w:r>
-        <w:t>Z tego powodu w niniejszym algorytmie nie jest ono bezpośrednio uwzględnione jako zmienna wejściowa.</w:t>
-      </w:r>
-    </w:p>
-    <w:p>
-      <w:pPr>
-        <w:spacing w:line="276" w:lineRule="auto"/>
-      </w:pPr>
-      <w:r>
-        <w:t>Choć teoretycznie można by je opisać parametrem wysokości i okresu fali, w praktyce wpływ falowania na prędkość jachtu zależy przede wszystkim od sposobu prowadzenia jednostki.</w:t>
-      </w:r>
-    </w:p>
-    <w:p>
-      <w:pPr>
-        <w:spacing w:line="276" w:lineRule="auto"/>
-      </w:pPr>
-    </w:p>
-    <w:p>
-      <w:pPr>
-        <w:spacing w:line="276" w:lineRule="auto"/>
-      </w:pPr>
-      <w:r>
-        <w:t>Warto również wspomnieć o zjawisku tzw. martwej fali.</w:t>
-      </w:r>
-    </w:p>
-    <w:p>
-      <w:pPr>
-        <w:spacing w:line="276" w:lineRule="auto"/>
-      </w:pPr>
-      <w:r>
-        <w:t>Występuje ono po ustaniu silnego wiatru – zanim morze zdąży się „uspokoić”, fale wciąż utrzymują się na poziomie odpowiadającym wcześniejszym, silniejszym podmuchom.</w:t>
-      </w:r>
-    </w:p>
-    <w:p>
-      <w:pPr>
-        <w:spacing w:line="276" w:lineRule="auto"/>
-      </w:pPr>
-      <w:r>
-        <w:t>W efekcie jacht może poruszać się w warunkach słabego wiatru, ale przy dużych falach, co powoduje znaczne straty prędkości mimo teoretycznie sprzyjających warunków aerodynamicznych.</w:t>
-      </w:r>
-      <w:r>
-        <w:br/>
-      </w:r>
-    </w:p>
-    <w:p>
-      <w:pPr>
-        <w:spacing w:line="276" w:lineRule="auto"/>
-      </w:pPr>
-      <w:r>
-        <w:t>Trym żagli</w:t>
-      </w:r>
-    </w:p>
-    <w:p>
-      <w:pPr>
-        <w:spacing w:line="276" w:lineRule="auto"/>
-      </w:pPr>
-    </w:p>
-    <w:p>
-      <w:pPr>
-        <w:spacing w:line="276" w:lineRule="auto"/>
-      </w:pPr>
-      <w:r>
-        <w:t>Na prędkość jachtu wpływa nie tylko rodzaj i powierzchnia użytych żagli, ale również sposób ich ustawienia, czyli tzw. trym żagli.</w:t>
-      </w:r>
-    </w:p>
-    <w:p>
-      <w:pPr>
-        <w:spacing w:line="276" w:lineRule="auto"/>
-      </w:pPr>
-      <w:r>
-        <w:t>Trym to dostosowanie kształtu i położenia żagla do aktualnych warunków wiatrowych oraz kursu jachtu, w celu uzyskania maksymalnej siły ciągu przy minimalnych stratach energii.</w:t>
-      </w:r>
-    </w:p>
-    <w:p>
-      <w:pPr>
-        <w:spacing w:line="276" w:lineRule="auto"/>
-      </w:pPr>
-    </w:p>
-    <w:p>
-      <w:pPr>
-        <w:spacing w:line="276" w:lineRule="auto"/>
-      </w:pPr>
-      <w:r>
-        <w:t>Na kształt żagla można wpływać na wiele sposobów.</w:t>
-      </w:r>
-    </w:p>
-    <w:p>
-      <w:pPr>
-        <w:spacing w:line="276" w:lineRule="auto"/>
-      </w:pPr>
-      <w:r>
-        <w:t xml:space="preserve">Najważniejszym z nich jest zmiana położenia żagla względem osi jachtu, czyli jego wybieranie lub luzowanie. Jednak to nie jedyny element trymu. Żagiel można również bardziej </w:t>
-      </w:r>
-      <w:proofErr w:type="spellStart"/>
-      <w:r>
-        <w:t>wypłaszczyć</w:t>
-      </w:r>
-      <w:proofErr w:type="spellEnd"/>
-      <w:r>
-        <w:t xml:space="preserve"> lub wybrzuszyć, co ma istotny wpływ na sposób przepływu powietrza po jego powierzchni.</w:t>
-      </w:r>
-    </w:p>
-    <w:p>
-      <w:pPr>
-        <w:spacing w:line="276" w:lineRule="auto"/>
-      </w:pPr>
-      <w:r>
-        <w:t>Dodatkowo można otworzyć lik wolny (tylną krawędź żagla), zmieniając kąt, pod jakim powietrze opuszcza żagiel, co pozwala dopasować jego pracę do aktualnej siły i kierunku wiatru.</w:t>
-      </w:r>
-    </w:p>
-    <w:p>
-      <w:pPr>
-        <w:spacing w:line="276" w:lineRule="auto"/>
-      </w:pPr>
-    </w:p>
-    <w:p>
-      <w:pPr>
-        <w:spacing w:line="276" w:lineRule="auto"/>
-      </w:pPr>
-      <w:r>
-        <w:t>Zmiana trymu jednego żagla wpływa również na pracę pozostałych.</w:t>
-      </w:r>
-    </w:p>
-    <w:p>
-      <w:pPr>
-        <w:spacing w:line="276" w:lineRule="auto"/>
-      </w:pPr>
-      <w:r>
         <w:t>Przykładowo, regulując trym foka lub genui, można znacząco zmienić charakter przepływu powietrza na grocie, poprawiając lub pogarszając jego efektywność.</w:t>
       </w:r>
     </w:p>
@@ -1461,42 +1346,155 @@
     </w:p>
     <w:p>
       <w:pPr>
-        <w:spacing w:line="276" w:lineRule="auto"/>
-      </w:pPr>
+        <w:tabs>
+          <w:tab w:val="left" w:pos="7383"/>
+        </w:tabs>
+        <w:spacing w:line="276" w:lineRule="auto"/>
+      </w:pPr>
+      <w:r>
+        <w:tab/>
+      </w:r>
       <w:r>
         <w:br/>
         <w:t>Tutaj będzie dywagacja jakie zmienne brać pod uwagę w algorytmie i dlaczego</w:t>
       </w:r>
+    </w:p>
+    <w:p>
+      <w:pPr>
+        <w:tabs>
+          <w:tab w:val="left" w:pos="7383"/>
+        </w:tabs>
+        <w:spacing w:line="276" w:lineRule="auto"/>
+      </w:pPr>
+      <w:r>
+        <w:t>(DO DOKŃCZENIA)</w:t>
+      </w:r>
+    </w:p>
+    <w:p>
+      <w:pPr>
+        <w:spacing w:line="276" w:lineRule="auto"/>
+      </w:pPr>
+      <w:r>
+        <w:t xml:space="preserve">Posiadając wiedze na temat prędkości jachtu możemy </w:t>
+      </w:r>
+      <w:proofErr w:type="spellStart"/>
+      <w:r>
+        <w:t>zacząc</w:t>
+      </w:r>
+      <w:proofErr w:type="spellEnd"/>
+      <w:r>
+        <w:t xml:space="preserve"> się zastanawiać na tematy jak przekuć to w odpowiednie dane dla naszego algorytmu. </w:t>
+      </w:r>
+    </w:p>
+    <w:p>
+      <w:pPr>
+        <w:spacing w:line="276" w:lineRule="auto"/>
+      </w:pPr>
+      <w:r>
+        <w:t>Sam w sobie algorytm ma za zadanie pomóc kapitanowi określić które żagle są najlepsze.</w:t>
+      </w:r>
       <w:r>
         <w:br/>
       </w:r>
       <w:r>
+        <w:t>Wiemy już, że im większy żagiel tym większa siła aerodynamiczna więc algorytm powinien  zawsze wybierać największe żagle.</w:t>
+      </w:r>
+      <w:r>
         <w:br/>
-      </w:r>
-    </w:p>
-    <w:p>
-      <w:pPr>
-        <w:spacing w:line="276" w:lineRule="auto"/>
-      </w:pPr>
-    </w:p>
-    <w:p>
-      <w:pPr>
-        <w:spacing w:line="276" w:lineRule="auto"/>
-      </w:pPr>
+        <w:t xml:space="preserve">Jednakże im większa siła </w:t>
+      </w:r>
+      <w:proofErr w:type="spellStart"/>
+      <w:r>
+        <w:t>aerodynamizcna</w:t>
+      </w:r>
+      <w:proofErr w:type="spellEnd"/>
+      <w:r>
+        <w:t xml:space="preserve"> tym większa siła przechylająca więc optymalne ożaglowanie nie zawsze będzie to największe.</w:t>
+      </w:r>
       <w:r>
         <w:br/>
-      </w:r>
-    </w:p>
-    <w:p>
-      <w:pPr>
-        <w:spacing w:line="276" w:lineRule="auto"/>
-      </w:pPr>
-    </w:p>
-    <w:p>
-      <w:pPr>
-        <w:spacing w:line="276" w:lineRule="auto"/>
-      </w:pPr>
-      <w:r>
+        <w:t>wiemy również że siła przechylająca przestaje mieć aż takie znaczenie w momencie w którym wychylimy żagle dalej od osi jachtu czyli w momencie w którym nie płyniemy tak ostro na wiatr,</w:t>
+      </w:r>
+    </w:p>
+    <w:p>
+      <w:pPr>
+        <w:spacing w:line="276" w:lineRule="auto"/>
+      </w:pPr>
+      <w:r>
+        <w:t>Czyli algorytm musi brać po uwagę to jak mocno wieje wiatr i skąd wieje.</w:t>
+      </w:r>
+    </w:p>
+    <w:p>
+      <w:pPr>
+        <w:spacing w:line="276" w:lineRule="auto"/>
+      </w:pPr>
+    </w:p>
+    <w:p>
+      <w:pPr>
+        <w:spacing w:line="276" w:lineRule="auto"/>
+      </w:pPr>
+      <w:r>
+        <w:t xml:space="preserve">Opisy </w:t>
+      </w:r>
+      <w:proofErr w:type="spellStart"/>
+      <w:r>
+        <w:t>róźnychn</w:t>
+      </w:r>
+      <w:proofErr w:type="spellEnd"/>
+      <w:r>
+        <w:t xml:space="preserve"> </w:t>
+      </w:r>
+      <w:proofErr w:type="spellStart"/>
+      <w:r>
+        <w:t>algorymów</w:t>
+      </w:r>
+      <w:proofErr w:type="spellEnd"/>
+      <w:r>
+        <w:t xml:space="preserve"> i dlaczego taki a nie inny</w:t>
+      </w:r>
+    </w:p>
+    <w:p>
+      <w:pPr>
+        <w:spacing w:line="276" w:lineRule="auto"/>
+      </w:pPr>
+    </w:p>
+    <w:p>
+      <w:pPr>
+        <w:spacing w:line="276" w:lineRule="auto"/>
+      </w:pPr>
+    </w:p>
+    <w:p>
+      <w:pPr>
+        <w:spacing w:line="276" w:lineRule="auto"/>
+      </w:pPr>
+      <w:r>
+        <w:br/>
+      </w:r>
+    </w:p>
+    <w:p>
+      <w:pPr>
+        <w:spacing w:line="276" w:lineRule="auto"/>
+      </w:pPr>
+    </w:p>
+    <w:p>
+      <w:pPr>
+        <w:spacing w:line="276" w:lineRule="auto"/>
+      </w:pPr>
+      <w:r>
+        <w:br/>
+      </w:r>
+    </w:p>
+    <w:p>
+      <w:pPr>
+        <w:spacing w:line="276" w:lineRule="auto"/>
+      </w:pPr>
+    </w:p>
+    <w:p>
+      <w:pPr>
+        <w:spacing w:line="276" w:lineRule="auto"/>
+      </w:pPr>
+      <w:r>
+        <w:lastRenderedPageBreak/>
         <w:t>Literatury:</w:t>
       </w:r>
       <w:r>
@@ -2500,6 +2498,7 @@
   <w:style w:type="character" w:default="1" w:styleId="Domylnaczcionkaakapitu">
     <w:name w:val="Default Paragraph Font"/>
     <w:uiPriority w:val="1"/>
+    <w:semiHidden/>
     <w:unhideWhenUsed/>
   </w:style>
   <w:style w:type="table" w:default="1" w:styleId="Standardowy">

</xml_diff>